<commit_message>
update no show data visualization
</commit_message>
<xml_diff>
--- a/reports/CareFlow_AI_Expanded_Analysis_Report_v2.docx
+++ b/reports/CareFlow_AI_Expanded_Analysis_Report_v2.docx
@@ -50,6 +50,9 @@
     <w:p>
       <w:pPr>
         <w:jc w:val="center"/>
+        <w:rPr>
+          <w:i/>
+        </w:rPr>
       </w:pPr>
       <w:r>
         <w:rPr>
@@ -57,6 +60,24 @@
         </w:rPr>
         <w:t>Source: Centers for Medicare &amp; Medicaid Services (CMS)</w:t>
       </w:r>
+    </w:p>
+    <w:p>
+      <w:pPr>
+        <w:jc w:val="center"/>
+      </w:pPr>
+      <w:hyperlink r:id="rId6" w:history="1">
+        <w:r>
+          <w:rPr>
+            <w:rStyle w:val="Hyperlink"/>
+          </w:rPr>
+          <w:t>https://data.cms.gov/data-api/v1/dataset/92396110-2aed-4d63-a6a2-5d6207d46a29/data</w:t>
+        </w:r>
+      </w:hyperlink>
+    </w:p>
+    <w:p>
+      <w:pPr>
+        <w:jc w:val="center"/>
+      </w:pPr>
     </w:p>
     <w:p>
       <w:r>
@@ -1049,7 +1070,7 @@
                     <pic:cNvPicPr/>
                   </pic:nvPicPr>
                   <pic:blipFill>
-                    <a:blip r:embed="rId6"/>
+                    <a:blip r:embed="rId7"/>
                     <a:stretch>
                       <a:fillRect/>
                     </a:stretch>
@@ -1107,7 +1128,7 @@
                     <pic:cNvPicPr/>
                   </pic:nvPicPr>
                   <pic:blipFill>
-                    <a:blip r:embed="rId7"/>
+                    <a:blip r:embed="rId8"/>
                     <a:stretch>
                       <a:fillRect/>
                     </a:stretch>
@@ -3160,7 +3181,7 @@
                     <pic:cNvPicPr/>
                   </pic:nvPicPr>
                   <pic:blipFill>
-                    <a:blip r:embed="rId8"/>
+                    <a:blip r:embed="rId9"/>
                     <a:stretch>
                       <a:fillRect/>
                     </a:stretch>
@@ -3253,7 +3274,7 @@
                     <pic:cNvPicPr/>
                   </pic:nvPicPr>
                   <pic:blipFill>
-                    <a:blip r:embed="rId9"/>
+                    <a:blip r:embed="rId10"/>
                     <a:stretch>
                       <a:fillRect/>
                     </a:stretch>
@@ -3354,7 +3375,7 @@
                     <pic:cNvPicPr/>
                   </pic:nvPicPr>
                   <pic:blipFill>
-                    <a:blip r:embed="rId10"/>
+                    <a:blip r:embed="rId11"/>
                     <a:stretch>
                       <a:fillRect/>
                     </a:stretch>
@@ -3425,7 +3446,7 @@
                     <pic:cNvPicPr/>
                   </pic:nvPicPr>
                   <pic:blipFill>
-                    <a:blip r:embed="rId11"/>
+                    <a:blip r:embed="rId12"/>
                     <a:stretch>
                       <a:fillRect/>
                     </a:stretch>
@@ -3497,7 +3518,7 @@
                     <pic:cNvPicPr/>
                   </pic:nvPicPr>
                   <pic:blipFill>
-                    <a:blip r:embed="rId12"/>
+                    <a:blip r:embed="rId13"/>
                     <a:stretch>
                       <a:fillRect/>
                     </a:stretch>
@@ -3581,7 +3602,7 @@
                     <pic:cNvPicPr/>
                   </pic:nvPicPr>
                   <pic:blipFill>
-                    <a:blip r:embed="rId13"/>
+                    <a:blip r:embed="rId14"/>
                     <a:stretch>
                       <a:fillRect/>
                     </a:stretch>
@@ -3694,7 +3715,7 @@
                     <pic:cNvPicPr/>
                   </pic:nvPicPr>
                   <pic:blipFill>
-                    <a:blip r:embed="rId14"/>
+                    <a:blip r:embed="rId15"/>
                     <a:stretch>
                       <a:fillRect/>
                     </a:stretch>
@@ -3790,7 +3811,7 @@
                     <pic:cNvPicPr/>
                   </pic:nvPicPr>
                   <pic:blipFill>
-                    <a:blip r:embed="rId15"/>
+                    <a:blip r:embed="rId16"/>
                     <a:stretch>
                       <a:fillRect/>
                     </a:stretch>
@@ -3886,7 +3907,7 @@
                     <pic:cNvPicPr/>
                   </pic:nvPicPr>
                   <pic:blipFill>
-                    <a:blip r:embed="rId16"/>
+                    <a:blip r:embed="rId17"/>
                     <a:stretch>
                       <a:fillRect/>
                     </a:stretch>
@@ -3957,7 +3978,7 @@
                     <pic:cNvPicPr/>
                   </pic:nvPicPr>
                   <pic:blipFill>
-                    <a:blip r:embed="rId17"/>
+                    <a:blip r:embed="rId18"/>
                     <a:stretch>
                       <a:fillRect/>
                     </a:stretch>
@@ -4053,7 +4074,7 @@
                     <pic:cNvPicPr/>
                   </pic:nvPicPr>
                   <pic:blipFill>
-                    <a:blip r:embed="rId18"/>
+                    <a:blip r:embed="rId19"/>
                     <a:stretch>
                       <a:fillRect/>
                     </a:stretch>
@@ -4149,7 +4170,7 @@
                     <pic:cNvPicPr/>
                   </pic:nvPicPr>
                   <pic:blipFill>
-                    <a:blip r:embed="rId19"/>
+                    <a:blip r:embed="rId20"/>
                     <a:stretch>
                       <a:fillRect/>
                     </a:stretch>
@@ -4261,7 +4282,7 @@
                     <pic:cNvPicPr/>
                   </pic:nvPicPr>
                   <pic:blipFill>
-                    <a:blip r:embed="rId20"/>
+                    <a:blip r:embed="rId21"/>
                     <a:stretch>
                       <a:fillRect/>
                     </a:stretch>
@@ -4319,7 +4340,7 @@
                     <pic:cNvPicPr/>
                   </pic:nvPicPr>
                   <pic:blipFill>
-                    <a:blip r:embed="rId21"/>
+                    <a:blip r:embed="rId22"/>
                     <a:stretch>
                       <a:fillRect/>
                     </a:stretch>
@@ -4410,7 +4431,7 @@
                     <pic:cNvPicPr/>
                   </pic:nvPicPr>
                   <pic:blipFill>
-                    <a:blip r:embed="rId22"/>
+                    <a:blip r:embed="rId23"/>
                     <a:stretch>
                       <a:fillRect/>
                     </a:stretch>
@@ -4469,7 +4490,7 @@
                     <pic:cNvPicPr/>
                   </pic:nvPicPr>
                   <pic:blipFill>
-                    <a:blip r:embed="rId23"/>
+                    <a:blip r:embed="rId24"/>
                     <a:stretch>
                       <a:fillRect/>
                     </a:stretch>
@@ -4565,7 +4586,7 @@
                     <pic:cNvPicPr/>
                   </pic:nvPicPr>
                   <pic:blipFill>
-                    <a:blip r:embed="rId24"/>
+                    <a:blip r:embed="rId25"/>
                     <a:stretch>
                       <a:fillRect/>
                     </a:stretch>
@@ -4623,7 +4644,7 @@
                     <pic:cNvPicPr/>
                   </pic:nvPicPr>
                   <pic:blipFill>
-                    <a:blip r:embed="rId25"/>
+                    <a:blip r:embed="rId26"/>
                     <a:stretch>
                       <a:fillRect/>
                     </a:stretch>
@@ -4719,7 +4740,7 @@
                     <pic:cNvPicPr/>
                   </pic:nvPicPr>
                   <pic:blipFill>
-                    <a:blip r:embed="rId26"/>
+                    <a:blip r:embed="rId27"/>
                     <a:stretch>
                       <a:fillRect/>
                     </a:stretch>
@@ -4831,7 +4852,7 @@
                     <pic:cNvPicPr/>
                   </pic:nvPicPr>
                   <pic:blipFill>
-                    <a:blip r:embed="rId27"/>
+                    <a:blip r:embed="rId28"/>
                     <a:stretch>
                       <a:fillRect/>
                     </a:stretch>
@@ -4927,7 +4948,7 @@
                     <pic:cNvPicPr/>
                   </pic:nvPicPr>
                   <pic:blipFill>
-                    <a:blip r:embed="rId28"/>
+                    <a:blip r:embed="rId29"/>
                     <a:stretch>
                       <a:fillRect/>
                     </a:stretch>
@@ -5023,7 +5044,7 @@
                     <pic:cNvPicPr/>
                   </pic:nvPicPr>
                   <pic:blipFill>
-                    <a:blip r:embed="rId29"/>
+                    <a:blip r:embed="rId30"/>
                     <a:stretch>
                       <a:fillRect/>
                     </a:stretch>
@@ -5119,7 +5140,7 @@
                     <pic:cNvPicPr/>
                   </pic:nvPicPr>
                   <pic:blipFill>
-                    <a:blip r:embed="rId30"/>
+                    <a:blip r:embed="rId31"/>
                     <a:stretch>
                       <a:fillRect/>
                     </a:stretch>
@@ -5215,7 +5236,7 @@
                     <pic:cNvPicPr/>
                   </pic:nvPicPr>
                   <pic:blipFill>
-                    <a:blip r:embed="rId31"/>
+                    <a:blip r:embed="rId32"/>
                     <a:stretch>
                       <a:fillRect/>
                     </a:stretch>
@@ -5311,7 +5332,7 @@
                     <pic:cNvPicPr/>
                   </pic:nvPicPr>
                   <pic:blipFill>
-                    <a:blip r:embed="rId32"/>
+                    <a:blip r:embed="rId33"/>
                     <a:stretch>
                       <a:fillRect/>
                     </a:stretch>
@@ -5407,7 +5428,7 @@
                     <pic:cNvPicPr/>
                   </pic:nvPicPr>
                   <pic:blipFill>
-                    <a:blip r:embed="rId33"/>
+                    <a:blip r:embed="rId34"/>
                     <a:stretch>
                       <a:fillRect/>
                     </a:stretch>
@@ -5540,7 +5561,7 @@
                     <pic:cNvPicPr/>
                   </pic:nvPicPr>
                   <pic:blipFill>
-                    <a:blip r:embed="rId34"/>
+                    <a:blip r:embed="rId35"/>
                     <a:stretch>
                       <a:fillRect/>
                     </a:stretch>
@@ -28148,6 +28169,29 @@
       </w:tcPr>
     </w:tblStylePr>
   </w:style>
+  <w:style w:type="character" w:styleId="Hyperlink">
+    <w:name w:val="Hyperlink"/>
+    <w:basedOn w:val="DefaultParagraphFont"/>
+    <w:uiPriority w:val="99"/>
+    <w:unhideWhenUsed/>
+    <w:rsid w:val="00230A86"/>
+    <w:rPr>
+      <w:color w:val="0000FF" w:themeColor="hyperlink"/>
+      <w:u w:val="single"/>
+    </w:rPr>
+  </w:style>
+  <w:style w:type="character" w:styleId="UnresolvedMention">
+    <w:name w:val="Unresolved Mention"/>
+    <w:basedOn w:val="DefaultParagraphFont"/>
+    <w:uiPriority w:val="99"/>
+    <w:semiHidden/>
+    <w:unhideWhenUsed/>
+    <w:rsid w:val="00230A86"/>
+    <w:rPr>
+      <w:color w:val="605E5C"/>
+      <w:shd w:val="clear" w:color="auto" w:fill="E1DFDD"/>
+    </w:rPr>
+  </w:style>
 </w:styles>
 </file>
 

</xml_diff>